<commit_message>
docs: publish refreshed V2.2 manifest, evidence index and report
- FINAL_MANIFEST.json: final runs E1 20261030T193936Z, E2 20261030T193709Z,
  E3 20261030T193723Z; source b88c364; evidence freeze 62d8909;
  20 passed, 0 failed, 0 skipped; raw PCAP SHA-256 values.
- EVIDENCE_INDEX.md: E1-03/04/06 mapped to raw PCAP + text rendering,
  E1-08 to HTTP/TLS responses + E1-REGRESSION, E2 gates and E3-01..E3-11
  to result.json scenario IDs; final vs historical runs separated.
- SUBMISSION_PROVENANCE.md, evidence/README.md: commit roles and
  historical/non-final run list.
- final_report.md/.docx/.pdf: new run IDs, evidence-index link, E1-03
  baseline PCAP and E1-08 regression references. No new experiments or
  claims.
</commit_message>
<xml_diff>
--- a/docs/final_report.docx
+++ b/docs/final_report.docx
@@ -220,7 +220,7 @@
                 <w:color w:val="263746"/>
                 <w:sz w:val="19"/>
               </w:rPr>
-              <w:t>20261028T202401Z</w:t>
+              <w:t>20261030T193936Z</w:t>
             </w:r>
           </w:p>
         </w:tc>
@@ -312,7 +312,7 @@
                 <w:color w:val="263746"/>
                 <w:sz w:val="19"/>
               </w:rPr>
-              <w:t>20261028T202400Z</w:t>
+              <w:t>20261030T193709Z</w:t>
             </w:r>
           </w:p>
         </w:tc>
@@ -404,7 +404,7 @@
                 <w:color w:val="263746"/>
                 <w:sz w:val="19"/>
               </w:rPr>
-              <w:t>20261028T202401Z</w:t>
+              <w:t>20261030T193723Z</w:t>
             </w:r>
           </w:p>
         </w:tc>
@@ -462,7 +462,7 @@
         <w:t>PASS</w:t>
       </w:r>
       <w:r>
-        <w:t xml:space="preserve">  ·  Clean-room checks: 20 passed, 0 failed, 0 skipped</w:t>
+        <w:t xml:space="preserve">  ·  Test suite: 20 passed, 0 failed, 0 skipped</w:t>
       </w:r>
     </w:p>
     <w:p>
@@ -488,7 +488,7 @@
           <w:color w:val="5D6C79"/>
           <w:sz w:val="19"/>
         </w:rPr>
-        <w:t>All reported values are reproduced from committed evidence under evidence/&lt;experiment&gt;/&lt;run_id&gt;.</w:t>
+        <w:t>All reported values are reproduced from committed evidence under evidence/&lt;experiment&gt;/&lt;run_id&gt;. Evidence map: docs/EVIDENCE_INDEX.md; final run IDs are pinned in evidence/FINAL_MANIFEST.json.</w:t>
       </w:r>
     </w:p>
     <w:p>
@@ -500,7 +500,7 @@
           <w:color w:val="5D6C79"/>
           <w:sz w:val="20"/>
         </w:rPr>
-        <w:t>Submission date: 30 October 2026</w:t>
+        <w:t>Submission date: 31 October 2026</w:t>
       </w:r>
     </w:p>
     <w:p>
@@ -1354,7 +1354,7 @@
           <w:color w:val="5D6C79"/>
           <w:sz w:val="18"/>
         </w:rPr>
-        <w:t>Table 1. E1 before/after evidence summary — final run 20261028T202401Z.</w:t>
+        <w:t>Table 1. E1 before/after evidence summary — final run 20261030T193936Z.</w:t>
       </w:r>
     </w:p>
     <w:tbl>
@@ -1558,7 +1558,7 @@
                 <w:color w:val="263746"/>
                 <w:sz w:val="16"/>
               </w:rPr>
-              <w:t>Gateway 10.77.0.2 resolves to attacker MAC 32:83:f3:8c:36:6f.</w:t>
+              <w:t>Gateway 10.77.0.2 resolves to attacker MAC 46:ca:02:a9:48:20.</w:t>
             </w:r>
           </w:p>
         </w:tc>
@@ -1587,7 +1587,7 @@
                 <w:color w:val="263746"/>
                 <w:sz w:val="16"/>
               </w:rPr>
-              <w:t>After restore, gateway MAC 8e:2e:67:45:e0:fd is present again.</w:t>
+              <w:t>After restore, gateway MAC 4a:0f:22:2d:9b:4a is present again.</w:t>
             </w:r>
           </w:p>
         </w:tc>
@@ -1679,7 +1679,7 @@
                 <w:color w:val="263746"/>
                 <w:sz w:val="16"/>
               </w:rPr>
-              <w:t>HTTP capture exposes the test token twice.</w:t>
+              <w:t>Baseline PCAP (E1-03) is captured on the victim before the attack; under MITM the attacker's HTTP capture exposes the test token twice.</w:t>
             </w:r>
           </w:p>
         </w:tc>
@@ -1737,7 +1737,7 @@
                 <w:color w:val="263746"/>
                 <w:sz w:val="16"/>
               </w:rPr>
-              <w:t>E1-04, E1-05, E1-06</w:t>
+              <w:t>E1-03, E1-04, E1-05, E1-06</w:t>
             </w:r>
           </w:p>
         </w:tc>
@@ -1829,7 +1829,7 @@
                 <w:color w:val="263746"/>
                 <w:sz w:val="16"/>
               </w:rPr>
-              <w:t>Trusted CA succeeds (exit 0); untrusted CA is rejected (exit 60, HTTP 000); normal HTTP/TLS works after restore.</w:t>
+              <w:t>Trusted CA succeeds (exit 0); untrusted CA fails the TLS handshake (exit 60; HTTP code 000 = no HTTP response); normal HTTP/TLS works after restore.</w:t>
             </w:r>
           </w:p>
         </w:tc>
@@ -2528,7 +2528,79 @@
           <w:b w:val="0"/>
           <w:i w:val="0"/>
         </w:rPr>
-        <w:t>.</w:t>
+        <w:t xml:space="preserve">, and the E1-03 baseline PCAP: raw </w:t>
+      </w:r>
+      <w:r>
+        <w:rPr>
+          <w:rFonts w:ascii="Consolas" w:hAnsi="Consolas"/>
+          <w:b w:val="0"/>
+          <w:i w:val="0"/>
+          <w:color w:val="284B63"/>
+          <w:sz w:val="18"/>
+        </w:rPr>
+        <w:t>E1-03_baseline.pcap</w:t>
+      </w:r>
+      <w:r>
+        <w:rPr>
+          <w:rFonts w:ascii="Segoe UI" w:hAnsi="Segoe UI"/>
+          <w:b w:val="0"/>
+          <w:i w:val="0"/>
+        </w:rPr>
+        <w:t xml:space="preserve"> with its text rendering </w:t>
+      </w:r>
+      <w:r>
+        <w:rPr>
+          <w:rFonts w:ascii="Consolas" w:hAnsi="Consolas"/>
+          <w:b w:val="0"/>
+          <w:i w:val="0"/>
+          <w:color w:val="284B63"/>
+          <w:sz w:val="18"/>
+        </w:rPr>
+        <w:t>E1-03_baseline_pcap.txt</w:t>
+      </w:r>
+      <w:r>
+        <w:rPr>
+          <w:rFonts w:ascii="Segoe UI" w:hAnsi="Segoe UI"/>
+          <w:b w:val="0"/>
+          <w:i w:val="0"/>
+        </w:rPr>
+        <w:t xml:space="preserve"> (captured on the victim before the attack, because before poisoning the switch does not forward victim/gateway traffic to the attacker). The MITM captures are raw </w:t>
+      </w:r>
+      <w:r>
+        <w:rPr>
+          <w:rFonts w:ascii="Consolas" w:hAnsi="Consolas"/>
+          <w:b w:val="0"/>
+          <w:i w:val="0"/>
+          <w:color w:val="284B63"/>
+          <w:sz w:val="18"/>
+        </w:rPr>
+        <w:t>E1-04_mitm_http.pcap</w:t>
+      </w:r>
+      <w:r>
+        <w:rPr>
+          <w:rFonts w:ascii="Segoe UI" w:hAnsi="Segoe UI"/>
+          <w:b w:val="0"/>
+          <w:i w:val="0"/>
+        </w:rPr>
+        <w:t xml:space="preserve"> and </w:t>
+      </w:r>
+      <w:r>
+        <w:rPr>
+          <w:rFonts w:ascii="Consolas" w:hAnsi="Consolas"/>
+          <w:b w:val="0"/>
+          <w:i w:val="0"/>
+          <w:color w:val="284B63"/>
+          <w:sz w:val="18"/>
+        </w:rPr>
+        <w:t>E1-06_mitm_https.pcap</w:t>
+      </w:r>
+      <w:r>
+        <w:rPr>
+          <w:rFonts w:ascii="Segoe UI" w:hAnsi="Segoe UI"/>
+          <w:b w:val="0"/>
+          <w:i w:val="0"/>
+        </w:rPr>
+        <w:t xml:space="preserve"> (captured on the attacker), each with a text rendering.</w:t>
       </w:r>
     </w:p>
     <w:p>
@@ -2601,7 +2673,7 @@
           <w:color w:val="284B63"/>
           <w:sz w:val="18"/>
         </w:rPr>
-        <w:t>8e:2e:67:45:e0:fd</w:t>
+        <w:t>4a:0f:22:2d:9b:4a</w:t>
       </w:r>
       <w:r>
         <w:rPr>
@@ -2619,7 +2691,7 @@
           <w:color w:val="284B63"/>
           <w:sz w:val="18"/>
         </w:rPr>
-        <w:t>32:83:f3:8c:36:6f</w:t>
+        <w:t>46:ca:02:a9:48:20</w:t>
       </w:r>
       <w:r>
         <w:rPr>
@@ -2913,6 +2985,32 @@
       </w:r>
       <w:r>
         <w:rPr>
+          <w:rFonts w:ascii="Segoe UI" w:hAnsi="Segoe UI"/>
+          <w:b w:val="0"/>
+          <w:i w:val="0"/>
+        </w:rPr>
+        <w:t xml:space="preserve">raw </w:t>
+      </w:r>
+      <w:r>
+        <w:rPr>
+          <w:rFonts w:ascii="Consolas" w:hAnsi="Consolas"/>
+          <w:b w:val="0"/>
+          <w:i w:val="0"/>
+          <w:color w:val="284B63"/>
+          <w:sz w:val="18"/>
+        </w:rPr>
+        <w:t>E1-04_mitm_http.pcap</w:t>
+      </w:r>
+      <w:r>
+        <w:rPr>
+          <w:rFonts w:ascii="Segoe UI" w:hAnsi="Segoe UI"/>
+          <w:b w:val="0"/>
+          <w:i w:val="0"/>
+        </w:rPr>
+        <w:t xml:space="preserve">, </w:t>
+      </w:r>
+      <w:r>
+        <w:rPr>
           <w:rFonts w:ascii="Consolas" w:hAnsi="Consolas"/>
           <w:b w:val="0"/>
           <w:i w:val="0"/>
@@ -2937,7 +3035,7 @@
           <w:color w:val="284B63"/>
           <w:sz w:val="18"/>
         </w:rPr>
-        <w:t>E1-05</w:t>
+        <w:t>E1-05_mitm_http_response.txt</w:t>
       </w:r>
       <w:r>
         <w:rPr>
@@ -3000,6 +3098,32 @@
           <w:i w:val="0"/>
         </w:rPr>
         <w:t xml:space="preserve"> appear in the attacker's TLS capture (0 occurrences), while the   victim still gets a valid response. Payload confidentiality preserved. Evidence   </w:t>
+      </w:r>
+      <w:r>
+        <w:rPr>
+          <w:rFonts w:ascii="Segoe UI" w:hAnsi="Segoe UI"/>
+          <w:b w:val="0"/>
+          <w:i w:val="0"/>
+        </w:rPr>
+        <w:t xml:space="preserve">raw </w:t>
+      </w:r>
+      <w:r>
+        <w:rPr>
+          <w:rFonts w:ascii="Consolas" w:hAnsi="Consolas"/>
+          <w:b w:val="0"/>
+          <w:i w:val="0"/>
+          <w:color w:val="284B63"/>
+          <w:sz w:val="18"/>
+        </w:rPr>
+        <w:t>E1-06_mitm_https.pcap</w:t>
+      </w:r>
+      <w:r>
+        <w:rPr>
+          <w:rFonts w:ascii="Segoe UI" w:hAnsi="Segoe UI"/>
+          <w:b w:val="0"/>
+          <w:i w:val="0"/>
+        </w:rPr>
+        <w:t xml:space="preserve">, </w:t>
       </w:r>
       <w:r>
         <w:rPr>
@@ -3091,7 +3215,7 @@
           <w:b w:val="0"/>
           <w:i w:val="0"/>
         </w:rPr>
-        <w:t xml:space="preserve">  CA the connection succeeds (curl exit 0); without the CA in the trust store the   connection is </w:t>
+        <w:t xml:space="preserve">  CA the connection succeeds (curl exit 0); without the CA in the trust store the   TLS handshake is </w:t>
       </w:r>
       <w:r>
         <w:rPr>
@@ -3107,7 +3231,7 @@
           <w:b w:val="0"/>
           <w:i w:val="0"/>
         </w:rPr>
-        <w:t xml:space="preserve"> (curl exit 60, HTTP code 000). Evidence   </w:t>
+        <w:t xml:space="preserve"> (curl exit 60). HTTP code 000 means no HTTP response was received; it is not an HTTP success. Evidence   </w:t>
       </w:r>
       <w:r>
         <w:rPr>
@@ -3243,6 +3367,42 @@
           <w:color w:val="284B63"/>
           <w:sz w:val="18"/>
         </w:rPr>
+        <w:t>E1-08_regression_http_response.txt</w:t>
+      </w:r>
+      <w:r>
+        <w:rPr>
+          <w:rFonts w:ascii="Segoe UI" w:hAnsi="Segoe UI"/>
+          <w:b w:val="0"/>
+          <w:i w:val="0"/>
+        </w:rPr>
+        <w:t xml:space="preserve">, </w:t>
+      </w:r>
+      <w:r>
+        <w:rPr>
+          <w:rFonts w:ascii="Consolas" w:hAnsi="Consolas"/>
+          <w:b w:val="0"/>
+          <w:i w:val="0"/>
+          <w:color w:val="284B63"/>
+          <w:sz w:val="18"/>
+        </w:rPr>
+        <w:t>E1-08_regression_https_response.txt</w:t>
+      </w:r>
+      <w:r>
+        <w:rPr>
+          <w:rFonts w:ascii="Segoe UI" w:hAnsi="Segoe UI"/>
+          <w:b w:val="0"/>
+          <w:i w:val="0"/>
+        </w:rPr>
+        <w:t xml:space="preserve"> (curl exit 0), and result.json scenario </w:t>
+      </w:r>
+      <w:r>
+        <w:rPr>
+          <w:rFonts w:ascii="Consolas" w:hAnsi="Consolas"/>
+          <w:b w:val="0"/>
+          <w:i w:val="0"/>
+          <w:color w:val="284B63"/>
+          <w:sz w:val="18"/>
+        </w:rPr>
         <w:t>E1-REGRESSION</w:t>
       </w:r>
       <w:r>
@@ -3324,7 +3484,7 @@
           <w:color w:val="5D6C79"/>
           <w:sz w:val="18"/>
         </w:rPr>
-        <w:t>Table 2. E2 before/after evidence summary — final run 20261028T202400Z.</w:t>
+        <w:t>Table 2. E2 before/after evidence summary — final run 20261030T193709Z.</w:t>
       </w:r>
     </w:p>
     <w:tbl>
@@ -3995,7 +4155,61 @@
           <w:b w:val="0"/>
           <w:i w:val="0"/>
         </w:rPr>
-        <w:t xml:space="preserve"> break TLS (spec §9).</w:t>
+        <w:t xml:space="preserve"> break TLS (spec §9). Each gate below maps to a result.json scenario ID and supporting file (</w:t>
+      </w:r>
+      <w:r>
+        <w:rPr>
+          <w:rFonts w:ascii="Consolas" w:hAnsi="Consolas"/>
+          <w:b w:val="0"/>
+          <w:i w:val="0"/>
+          <w:color w:val="284B63"/>
+          <w:sz w:val="18"/>
+        </w:rPr>
+        <w:t>audit_log.json</w:t>
+      </w:r>
+      <w:r>
+        <w:rPr>
+          <w:rFonts w:ascii="Segoe UI" w:hAnsi="Segoe UI"/>
+          <w:b w:val="0"/>
+          <w:i w:val="0"/>
+        </w:rPr>
+        <w:t xml:space="preserve">, </w:t>
+      </w:r>
+      <w:r>
+        <w:rPr>
+          <w:rFonts w:ascii="Consolas" w:hAnsi="Consolas"/>
+          <w:b w:val="0"/>
+          <w:i w:val="0"/>
+          <w:color w:val="284B63"/>
+          <w:sz w:val="18"/>
+        </w:rPr>
+        <w:t>device_history.json</w:t>
+      </w:r>
+      <w:r>
+        <w:rPr>
+          <w:rFonts w:ascii="Segoe UI" w:hAnsi="Segoe UI"/>
+          <w:b w:val="0"/>
+          <w:i w:val="0"/>
+        </w:rPr>
+        <w:t xml:space="preserve">) in </w:t>
+      </w:r>
+      <w:r>
+        <w:rPr>
+          <w:rFonts w:ascii="Consolas" w:hAnsi="Consolas"/>
+          <w:b w:val="0"/>
+          <w:i w:val="0"/>
+          <w:color w:val="284B63"/>
+          <w:sz w:val="18"/>
+        </w:rPr>
+        <w:t>docs/EVIDENCE_INDEX.md</w:t>
+      </w:r>
+      <w:r>
+        <w:rPr>
+          <w:rFonts w:ascii="Segoe UI" w:hAnsi="Segoe UI"/>
+          <w:b w:val="0"/>
+          <w:i w:val="0"/>
+        </w:rPr>
+        <w:t xml:space="preserve"> § E2.</w:t>
       </w:r>
     </w:p>
     <w:p>
@@ -4825,7 +5039,7 @@
           <w:color w:val="5D6C79"/>
           <w:sz w:val="18"/>
         </w:rPr>
-        <w:t>Table 3. E3 before/after evidence summary — final run 20261028T202401Z.</w:t>
+        <w:t>Table 3. E3 before/after evidence summary — final run 20261030T193723Z.</w:t>
       </w:r>
     </w:p>
     <w:tbl>
@@ -5359,7 +5573,61 @@
           <w:b w:val="0"/>
           <w:i w:val="0"/>
         </w:rPr>
-        <w:t xml:space="preserve"> Attacker reaches the Backend API and supplies input (spec §6).</w:t>
+        <w:t xml:space="preserve"> Attacker reaches the Backend API and supplies input (spec §6). Evidence items E3-01…E3-11 map to </w:t>
+      </w:r>
+      <w:r>
+        <w:rPr>
+          <w:rFonts w:ascii="Consolas" w:hAnsi="Consolas"/>
+          <w:b w:val="0"/>
+          <w:i w:val="0"/>
+          <w:color w:val="284B63"/>
+          <w:sz w:val="18"/>
+        </w:rPr>
+        <w:t>E3-01_user_input.txt</w:t>
+      </w:r>
+      <w:r>
+        <w:rPr>
+          <w:rFonts w:ascii="Segoe UI" w:hAnsi="Segoe UI"/>
+          <w:b w:val="0"/>
+          <w:i w:val="0"/>
+        </w:rPr>
+        <w:t xml:space="preserve">, </w:t>
+      </w:r>
+      <w:r>
+        <w:rPr>
+          <w:rFonts w:ascii="Consolas" w:hAnsi="Consolas"/>
+          <w:b w:val="0"/>
+          <w:i w:val="0"/>
+          <w:color w:val="284B63"/>
+          <w:sz w:val="18"/>
+        </w:rPr>
+        <w:t>E3-02_generated_sql.txt</w:t>
+      </w:r>
+      <w:r>
+        <w:rPr>
+          <w:rFonts w:ascii="Segoe UI" w:hAnsi="Segoe UI"/>
+          <w:b w:val="0"/>
+          <w:i w:val="0"/>
+        </w:rPr>
+        <w:t xml:space="preserve">, and result.json scenario IDs in </w:t>
+      </w:r>
+      <w:r>
+        <w:rPr>
+          <w:rFonts w:ascii="Consolas" w:hAnsi="Consolas"/>
+          <w:b w:val="0"/>
+          <w:i w:val="0"/>
+          <w:color w:val="284B63"/>
+          <w:sz w:val="18"/>
+        </w:rPr>
+        <w:t>docs/EVIDENCE_INDEX.md</w:t>
+      </w:r>
+      <w:r>
+        <w:rPr>
+          <w:rFonts w:ascii="Segoe UI" w:hAnsi="Segoe UI"/>
+          <w:b w:val="0"/>
+          <w:i w:val="0"/>
+        </w:rPr>
+        <w:t xml:space="preserve"> § E3.</w:t>
       </w:r>
     </w:p>
     <w:p>

</xml_diff>

<commit_message>
docs: clarify cross-layer and E3 evidence semantics
- Cross-layer: ARP spoofing compromises the L2 forwarding path; TLS +
  certificate validation protect payload confidentiality/integrity on a
  hostile path. TLS does not prevent ARP spoofing, availability loss or
  endpoint compromise.
- E3: state the evaluation boundary (data-access functions + DB
  authorization called directly; HTTP transport not independently
  exercised). E3-03 is the application result representation, not a
  captured HTTP response. SQLi claims unchanged.
- Test count 27 passed, 0 failed, 0 skipped; DOCX/PDF regenerated from
  the existing template.
</commit_message>
<xml_diff>
--- a/docs/final_report.docx
+++ b/docs/final_report.docx
@@ -462,7 +462,7 @@
         <w:t>PASS</w:t>
       </w:r>
       <w:r>
-        <w:t xml:space="preserve">  ·  Test suite: 20 passed, 0 failed, 0 skipped</w:t>
+        <w:t xml:space="preserve">  ·  Test suite: 27 passed, 0 failed, 0 skipped</w:t>
       </w:r>
     </w:p>
     <w:p>
@@ -5632,6 +5632,46 @@
     </w:p>
     <w:p>
       <w:pPr>
+        <w:keepLines/>
+        <w:widowControl/>
+      </w:pPr>
+      <w:r>
+        <w:rPr>
+          <w:rFonts w:ascii="Segoe UI" w:hAnsi="Segoe UI"/>
+          <w:b/>
+          <w:i w:val="0"/>
+        </w:rPr>
+        <w:t xml:space="preserve">Evaluation boundary.</w:t>
+      </w:r>
+      <w:r>
+        <w:rPr>
+          <w:rFonts w:ascii="Segoe UI" w:hAnsi="Segoe UI"/>
+          <w:b w:val="0"/>
+          <w:i w:val="0"/>
+        </w:rPr>
+        <w:t xml:space="preserve"> E3 validates the application data-access (code/data) boundary and database authorization. The runner calls the data-access functions directly against the lab PostgreSQL for deterministic evidence; HTTP transport behavior is not independently evaluated. E3-03 is therefore the application response/result representation (returned rows in </w:t>
+      </w:r>
+      <w:r>
+        <w:rPr>
+          <w:rFonts w:ascii="Consolas" w:hAnsi="Consolas"/>
+          <w:b w:val="0"/>
+          <w:i w:val="0"/>
+          <w:color w:val="284B63"/>
+          <w:sz w:val="18"/>
+        </w:rPr>
+        <w:t>result.json</w:t>
+      </w:r>
+      <w:r>
+        <w:rPr>
+          <w:rFonts w:ascii="Segoe UI" w:hAnsi="Segoe UI"/>
+          <w:b w:val="0"/>
+          <w:i w:val="0"/>
+        </w:rPr>
+        <w:t xml:space="preserve">), not a captured HTTP response.</w:t>
+      </w:r>
+    </w:p>
+    <w:p>
+      <w:pPr>
         <w:pStyle w:val="ListBullet"/>
         <w:keepLines/>
         <w:widowControl/>
@@ -6375,6 +6415,28 @@
           <w:sz w:val="18"/>
         </w:rPr>
         <w:t>Figure 2. Cross-layer trust boundaries and their corresponding controls.</w:t>
+      </w:r>
+    </w:p>
+    <w:p>
+      <w:pPr>
+        <w:keepLines/>
+        <w:widowControl/>
+      </w:pPr>
+      <w:r>
+        <w:rPr>
+          <w:rFonts w:ascii="Segoe UI" w:hAnsi="Segoe UI"/>
+          <w:b/>
+          <w:i w:val="0"/>
+        </w:rPr>
+        <w:t xml:space="preserve">Network trust (E1).</w:t>
+      </w:r>
+      <w:r>
+        <w:rPr>
+          <w:rFonts w:ascii="Segoe UI" w:hAnsi="Segoe UI"/>
+          <w:b w:val="0"/>
+          <w:i w:val="0"/>
+        </w:rPr>
+        <w:t xml:space="preserve"> ARP spoofing demonstrates compromise of the L2 forwarding path. TLS with certificate validation protects application payload confidentiality and integrity even when that path is hostile. TLS does not prevent ARP spoofing and does not restore the forwarding path, and it protects neither availability nor a compromised endpoint.</w:t>
       </w:r>
     </w:p>
     <w:p>

</xml_diff>